<commit_message>
+ add readme + fix CV
</commit_message>
<xml_diff>
--- a/portfolio-fe/public/CV-SoftwareEngineer.docx
+++ b/portfolio-fe/public/CV-SoftwareEngineer.docx
@@ -22,6 +22,9 @@
         <w:gridCol w:w="3864"/>
       </w:tblGrid>
       <w:tr>
+        <w:trPr>
+          <w:trHeight w:val="284"/>
+        </w:trPr>
         <w:tc>
           <w:tcPr>
             <w:tcW w:w="3596" w:type="dxa"/>
@@ -29,20 +32,123 @@
           <w:p>
             <w:pPr>
               <w:rPr>
-                <w:rFonts w:ascii="Times New Roman" w:hAnsi="Times New Roman" w:cs="Times New Roman"/>
-                <w:sz w:val="22"/>
-                <w:szCs w:val="22"/>
-              </w:rPr>
-            </w:pPr>
-            <w:r>
-              <w:rPr>
                 <w:rStyle w:val="Hyperlink"/>
                 <w:rFonts w:ascii="Times New Roman" w:hAnsi="Times New Roman" w:cs="Times New Roman"/>
                 <w:sz w:val="22"/>
                 <w:szCs w:val="22"/>
               </w:rPr>
-              <w:t>github.com/tuanvu2703</w:t>
-            </w:r>
+            </w:pPr>
+            <w:r>
+              <w:rPr>
+                <w:rStyle w:val="Hyperlink"/>
+                <w:rFonts w:ascii="Times New Roman" w:hAnsi="Times New Roman" w:cs="Times New Roman"/>
+                <w:sz w:val="22"/>
+                <w:szCs w:val="22"/>
+              </w:rPr>
+              <w:fldChar w:fldCharType="begin"/>
+            </w:r>
+            <w:r>
+              <w:rPr>
+                <w:rStyle w:val="Hyperlink"/>
+                <w:rFonts w:ascii="Times New Roman" w:hAnsi="Times New Roman" w:cs="Times New Roman"/>
+                <w:sz w:val="22"/>
+                <w:szCs w:val="22"/>
+              </w:rPr>
+              <w:instrText>HYPERLINK "https://github.com/tuanvu2703"</w:instrText>
+            </w:r>
+            <w:r>
+              <w:rPr>
+                <w:rStyle w:val="Hyperlink"/>
+                <w:rFonts w:ascii="Times New Roman" w:hAnsi="Times New Roman" w:cs="Times New Roman"/>
+                <w:sz w:val="22"/>
+                <w:szCs w:val="22"/>
+              </w:rPr>
+            </w:r>
+            <w:r>
+              <w:rPr>
+                <w:rStyle w:val="Hyperlink"/>
+                <w:rFonts w:ascii="Times New Roman" w:hAnsi="Times New Roman" w:cs="Times New Roman"/>
+                <w:sz w:val="22"/>
+                <w:szCs w:val="22"/>
+              </w:rPr>
+              <w:fldChar w:fldCharType="separate"/>
+            </w:r>
+            <w:r>
+              <w:rPr>
+                <w:rStyle w:val="Hyperlink"/>
+                <w:rFonts w:ascii="Times New Roman" w:hAnsi="Times New Roman" w:cs="Times New Roman"/>
+                <w:sz w:val="22"/>
+                <w:szCs w:val="22"/>
+              </w:rPr>
+              <w:t>github.com/tuan</w:t>
+            </w:r>
+            <w:r>
+              <w:rPr>
+                <w:rStyle w:val="Hyperlink"/>
+                <w:rFonts w:ascii="Times New Roman" w:hAnsi="Times New Roman" w:cs="Times New Roman"/>
+                <w:sz w:val="22"/>
+                <w:szCs w:val="22"/>
+              </w:rPr>
+              <w:t>v</w:t>
+            </w:r>
+            <w:r>
+              <w:rPr>
+                <w:rStyle w:val="Hyperlink"/>
+                <w:rFonts w:ascii="Times New Roman" w:hAnsi="Times New Roman" w:cs="Times New Roman"/>
+                <w:sz w:val="22"/>
+                <w:szCs w:val="22"/>
+              </w:rPr>
+              <w:t>u2703</w:t>
+            </w:r>
+            <w:r>
+              <w:rPr>
+                <w:rStyle w:val="Hyperlink"/>
+                <w:rFonts w:ascii="Times New Roman" w:hAnsi="Times New Roman" w:cs="Times New Roman"/>
+                <w:sz w:val="22"/>
+                <w:szCs w:val="22"/>
+              </w:rPr>
+              <w:fldChar w:fldCharType="end"/>
+            </w:r>
+          </w:p>
+          <w:p>
+            <w:pPr>
+              <w:rPr>
+                <w:rFonts w:ascii="Times New Roman" w:hAnsi="Times New Roman" w:cs="Times New Roman"/>
+                <w:color w:val="467886" w:themeColor="hyperlink"/>
+                <w:sz w:val="22"/>
+                <w:szCs w:val="22"/>
+                <w:u w:val="single"/>
+              </w:rPr>
+            </w:pPr>
+            <w:hyperlink r:id="rId8" w:history="1">
+              <w:r>
+                <w:rPr>
+                  <w:rStyle w:val="Hyperlink"/>
+                  <w:rFonts w:ascii="Times New Roman" w:hAnsi="Times New Roman" w:cs="Times New Roman"/>
+                  <w:sz w:val="22"/>
+                  <w:szCs w:val="22"/>
+                </w:rPr>
+                <w:t>portfolio-phamtuanvukg2703s-projects.vercel.a</w:t>
+              </w:r>
+              <w:r>
+                <w:rPr>
+                  <w:rStyle w:val="Hyperlink"/>
+                  <w:rFonts w:ascii="Times New Roman" w:hAnsi="Times New Roman" w:cs="Times New Roman"/>
+                  <w:sz w:val="22"/>
+                  <w:szCs w:val="22"/>
+                </w:rPr>
+                <w:t>p</w:t>
+              </w:r>
+              <w:r>
+                <w:rPr>
+                  <w:rStyle w:val="Hyperlink"/>
+                  <w:rFonts w:ascii="Times New Roman" w:hAnsi="Times New Roman" w:cs="Times New Roman"/>
+                  <w:sz w:val="22"/>
+                  <w:szCs w:val="22"/>
+                </w:rPr>
+                <w:t>p</w:t>
+              </w:r>
+            </w:hyperlink>
           </w:p>
         </w:tc>
         <w:tc>
@@ -140,7 +246,7 @@
                 <w:szCs w:val="22"/>
               </w:rPr>
             </w:pPr>
-            <w:hyperlink r:id="rId8" w:history="1">
+            <w:hyperlink r:id="rId9" w:history="1">
               <w:r>
                 <w:rPr>
                   <w:rStyle w:val="Hyperlink"/>
@@ -1183,7 +1289,7 @@
               </w:rPr>
               <w:t xml:space="preserve">GitHub: </w:t>
             </w:r>
-            <w:hyperlink r:id="rId9" w:history="1">
+            <w:hyperlink r:id="rId10" w:history="1">
               <w:r>
                 <w:rPr>
                   <w:rStyle w:val="Hyperlink"/>
@@ -1507,7 +1613,7 @@
               </w:rPr>
               <w:t xml:space="preserve">GitHub: </w:t>
             </w:r>
-            <w:hyperlink r:id="rId10" w:history="1">
+            <w:hyperlink r:id="rId11" w:history="1">
               <w:r>
                 <w:rPr>
                   <w:rStyle w:val="Hyperlink"/>
@@ -3685,7 +3791,6 @@
   <w:style w:type="character" w:default="1" w:styleId="DefaultParagraphFont">
     <w:name w:val="Default Paragraph Font"/>
     <w:uiPriority w:val="1"/>
-    <w:semiHidden/>
     <w:unhideWhenUsed/>
   </w:style>
   <w:style w:type="table" w:default="1" w:styleId="TableNormal">

</xml_diff>